<commit_message>
fix: rebuild FIR templates with real placeholders, fix patrol blank screen crash
</commit_message>
<xml_diff>
--- a/backend/templates/documents/accused_panchanama.docx
+++ b/backend/templates/documents/accused_panchanama.docx
@@ -3,8 +3,644 @@
 <w:document xmlns:wpc="http://schemas.microsoft.com/office/word/2010/wordprocessingCanvas" xmlns:mo="http://schemas.microsoft.com/office/mac/office/2008/main" xmlns:mc="http://schemas.openxmlformats.org/markup-compatibility/2006" xmlns:mv="urn:schemas-microsoft-com:mac:vml" xmlns:o="urn:schemas-microsoft-com:office:office" xmlns:r="http://schemas.openxmlformats.org/officeDocument/2006/relationships" xmlns:m="http://schemas.openxmlformats.org/officeDocument/2006/math" xmlns:v="urn:schemas-microsoft-com:vml" xmlns:wp14="http://schemas.microsoft.com/office/word/2010/wordprocessingDrawing" xmlns:wp="http://schemas.openxmlformats.org/drawingml/2006/wordprocessingDrawing" xmlns:w10="urn:schemas-microsoft-com:office:word" xmlns:w="http://schemas.openxmlformats.org/wordprocessingml/2006/main" xmlns:w14="http://schemas.microsoft.com/office/word/2010/wordml" xmlns:wpg="http://schemas.microsoft.com/office/word/2010/wordprocessingGroup" xmlns:wpi="http://schemas.microsoft.com/office/word/2010/wordprocessingInk" xmlns:wne="http://schemas.microsoft.com/office/word/2006/wordml" xmlns:wps="http://schemas.microsoft.com/office/word/2010/wordprocessingShape" mc:Ignorable="w14 wp14">
   <w:body>
     <w:p>
+      <w:pPr>
+        <w:jc w:val="center"/>
+      </w:pPr>
       <w:r>
-        <w:t>Template for accused_panchanama.docx</w:t>
+        <w:rPr>
+          <w:b/>
+          <w:sz w:val="32"/>
+        </w:rPr>
+        <w:t>ACCUSED PANCHANAMA</w:t>
+      </w:r>
+    </w:p>
+    <w:p>
+      <w:pPr>
+        <w:jc w:val="center"/>
+      </w:pPr>
+      <w:r>
+        <w:rPr>
+          <w:b/>
+        </w:rPr>
+        <w:t>Under Bharatiya Nagarik Suraksha Sanhita (BNSS) 2023</w:t>
+      </w:r>
+    </w:p>
+    <w:p/>
+    <w:tbl>
+      <w:tblPr>
+        <w:tblStyle w:val="TableGrid"/>
+        <w:tblW w:type="auto" w:w="0"/>
+        <w:tblLook w:firstColumn="1" w:firstRow="1" w:lastColumn="0" w:lastRow="0" w:noHBand="0" w:noVBand="1" w:val="04A0"/>
+      </w:tblPr>
+      <w:tblGrid>
+        <w:gridCol w:w="4320"/>
+        <w:gridCol w:w="4320"/>
+      </w:tblGrid>
+      <w:tr>
+        <w:tc>
+          <w:tcPr>
+            <w:tcW w:type="dxa" w:w="4320"/>
+          </w:tcPr>
+          <w:p>
+            <w:r>
+              <w:rPr>
+                <w:b/>
+              </w:rPr>
+              <w:t>FIR Number</w:t>
+            </w:r>
+          </w:p>
+        </w:tc>
+        <w:tc>
+          <w:tcPr>
+            <w:tcW w:type="dxa" w:w="4320"/>
+          </w:tcPr>
+          <w:p>
+            <w:r>
+              <w:t>{{FIR_NO}}</w:t>
+            </w:r>
+          </w:p>
+        </w:tc>
+      </w:tr>
+      <w:tr>
+        <w:tc>
+          <w:tcPr>
+            <w:tcW w:type="dxa" w:w="4320"/>
+          </w:tcPr>
+          <w:p>
+            <w:r>
+              <w:rPr>
+                <w:b/>
+              </w:rPr>
+              <w:t>Date of Report</w:t>
+            </w:r>
+          </w:p>
+        </w:tc>
+        <w:tc>
+          <w:tcPr>
+            <w:tcW w:type="dxa" w:w="4320"/>
+          </w:tcPr>
+          <w:p>
+            <w:r>
+              <w:t>{{DATE}}</w:t>
+            </w:r>
+          </w:p>
+        </w:tc>
+      </w:tr>
+      <w:tr>
+        <w:tc>
+          <w:tcPr>
+            <w:tcW w:type="dxa" w:w="4320"/>
+          </w:tcPr>
+          <w:p>
+            <w:r>
+              <w:rPr>
+                <w:b/>
+              </w:rPr>
+              <w:t>Police Station</w:t>
+            </w:r>
+          </w:p>
+        </w:tc>
+        <w:tc>
+          <w:tcPr>
+            <w:tcW w:type="dxa" w:w="4320"/>
+          </w:tcPr>
+          <w:p>
+            <w:r>
+              <w:t>{{PS_NAME}}</w:t>
+            </w:r>
+          </w:p>
+        </w:tc>
+      </w:tr>
+      <w:tr>
+        <w:tc>
+          <w:tcPr>
+            <w:tcW w:type="dxa" w:w="4320"/>
+          </w:tcPr>
+          <w:p>
+            <w:r>
+              <w:rPr>
+                <w:b/>
+              </w:rPr>
+              <w:t>Investigating Officer</w:t>
+            </w:r>
+          </w:p>
+        </w:tc>
+        <w:tc>
+          <w:tcPr>
+            <w:tcW w:type="dxa" w:w="4320"/>
+          </w:tcPr>
+          <w:p>
+            <w:r>
+              <w:t>{{IO_NAME}}</w:t>
+            </w:r>
+          </w:p>
+        </w:tc>
+      </w:tr>
+      <w:tr>
+        <w:tc>
+          <w:tcPr>
+            <w:tcW w:type="dxa" w:w="4320"/>
+          </w:tcPr>
+          <w:p>
+            <w:r>
+              <w:rPr>
+                <w:b/>
+              </w:rPr>
+              <w:t>Badge No.</w:t>
+            </w:r>
+          </w:p>
+        </w:tc>
+        <w:tc>
+          <w:tcPr>
+            <w:tcW w:type="dxa" w:w="4320"/>
+          </w:tcPr>
+          <w:p>
+            <w:r>
+              <w:t>{{IO_BADGE}}</w:t>
+            </w:r>
+          </w:p>
+        </w:tc>
+      </w:tr>
+    </w:tbl>
+    <w:p/>
+    <w:p>
+      <w:r>
+        <w:rPr>
+          <w:b/>
+        </w:rPr>
+        <w:t>COMPLAINANT / VICTIM DETAILS</w:t>
+      </w:r>
+    </w:p>
+    <w:tbl>
+      <w:tblPr>
+        <w:tblStyle w:val="TableGrid"/>
+        <w:tblW w:type="auto" w:w="0"/>
+        <w:tblLook w:firstColumn="1" w:firstRow="1" w:lastColumn="0" w:lastRow="0" w:noHBand="0" w:noVBand="1" w:val="04A0"/>
+      </w:tblPr>
+      <w:tblGrid>
+        <w:gridCol w:w="4320"/>
+        <w:gridCol w:w="4320"/>
+      </w:tblGrid>
+      <w:tr>
+        <w:tc>
+          <w:tcPr>
+            <w:tcW w:type="dxa" w:w="4320"/>
+          </w:tcPr>
+          <w:p>
+            <w:r>
+              <w:rPr>
+                <w:b/>
+              </w:rPr>
+              <w:t>Victim Name</w:t>
+            </w:r>
+          </w:p>
+        </w:tc>
+        <w:tc>
+          <w:tcPr>
+            <w:tcW w:type="dxa" w:w="4320"/>
+          </w:tcPr>
+          <w:p>
+            <w:r>
+              <w:t>{{VICTIM_NAME}}</w:t>
+            </w:r>
+          </w:p>
+        </w:tc>
+      </w:tr>
+      <w:tr>
+        <w:tc>
+          <w:tcPr>
+            <w:tcW w:type="dxa" w:w="4320"/>
+          </w:tcPr>
+          <w:p>
+            <w:r>
+              <w:rPr>
+                <w:b/>
+              </w:rPr>
+              <w:t>Address</w:t>
+            </w:r>
+          </w:p>
+        </w:tc>
+        <w:tc>
+          <w:tcPr>
+            <w:tcW w:type="dxa" w:w="4320"/>
+          </w:tcPr>
+          <w:p>
+            <w:r>
+              <w:t>{{VICTIM_ADDRESS}}</w:t>
+            </w:r>
+          </w:p>
+        </w:tc>
+      </w:tr>
+      <w:tr>
+        <w:tc>
+          <w:tcPr>
+            <w:tcW w:type="dxa" w:w="4320"/>
+          </w:tcPr>
+          <w:p>
+            <w:r>
+              <w:rPr>
+                <w:b/>
+              </w:rPr>
+              <w:t>Age</w:t>
+            </w:r>
+          </w:p>
+        </w:tc>
+        <w:tc>
+          <w:tcPr>
+            <w:tcW w:type="dxa" w:w="4320"/>
+          </w:tcPr>
+          <w:p>
+            <w:r>
+              <w:t>{{VICTIM_AGE}}</w:t>
+            </w:r>
+          </w:p>
+        </w:tc>
+      </w:tr>
+      <w:tr>
+        <w:tc>
+          <w:tcPr>
+            <w:tcW w:type="dxa" w:w="4320"/>
+          </w:tcPr>
+          <w:p>
+            <w:r>
+              <w:rPr>
+                <w:b/>
+              </w:rPr>
+              <w:t>Phone</w:t>
+            </w:r>
+          </w:p>
+        </w:tc>
+        <w:tc>
+          <w:tcPr>
+            <w:tcW w:type="dxa" w:w="4320"/>
+          </w:tcPr>
+          <w:p>
+            <w:r>
+              <w:t>{{VICTIM_PHONE}}</w:t>
+            </w:r>
+          </w:p>
+        </w:tc>
+      </w:tr>
+    </w:tbl>
+    <w:p/>
+    <w:p>
+      <w:r>
+        <w:rPr>
+          <w:b/>
+        </w:rPr>
+        <w:t>OFFENCE DETAILS</w:t>
+      </w:r>
+    </w:p>
+    <w:tbl>
+      <w:tblPr>
+        <w:tblStyle w:val="TableGrid"/>
+        <w:tblW w:type="auto" w:w="0"/>
+        <w:tblLook w:firstColumn="1" w:firstRow="1" w:lastColumn="0" w:lastRow="0" w:noHBand="0" w:noVBand="1" w:val="04A0"/>
+      </w:tblPr>
+      <w:tblGrid>
+        <w:gridCol w:w="4320"/>
+        <w:gridCol w:w="4320"/>
+      </w:tblGrid>
+      <w:tr>
+        <w:tc>
+          <w:tcPr>
+            <w:tcW w:type="dxa" w:w="4320"/>
+          </w:tcPr>
+          <w:p>
+            <w:r>
+              <w:rPr>
+                <w:b/>
+              </w:rPr>
+              <w:t>Crime Type</w:t>
+            </w:r>
+          </w:p>
+        </w:tc>
+        <w:tc>
+          <w:tcPr>
+            <w:tcW w:type="dxa" w:w="4320"/>
+          </w:tcPr>
+          <w:p>
+            <w:r>
+              <w:t>{{CRIME_TYPE}}</w:t>
+            </w:r>
+          </w:p>
+        </w:tc>
+      </w:tr>
+      <w:tr>
+        <w:tc>
+          <w:tcPr>
+            <w:tcW w:type="dxa" w:w="4320"/>
+          </w:tcPr>
+          <w:p>
+            <w:r>
+              <w:rPr>
+                <w:b/>
+              </w:rPr>
+              <w:t>Date of Offence</w:t>
+            </w:r>
+          </w:p>
+        </w:tc>
+        <w:tc>
+          <w:tcPr>
+            <w:tcW w:type="dxa" w:w="4320"/>
+          </w:tcPr>
+          <w:p>
+            <w:r>
+              <w:t>{{CRIME_DATE}}</w:t>
+            </w:r>
+          </w:p>
+        </w:tc>
+      </w:tr>
+      <w:tr>
+        <w:tc>
+          <w:tcPr>
+            <w:tcW w:type="dxa" w:w="4320"/>
+          </w:tcPr>
+          <w:p>
+            <w:r>
+              <w:rPr>
+                <w:b/>
+              </w:rPr>
+              <w:t>Place of Offence</w:t>
+            </w:r>
+          </w:p>
+        </w:tc>
+        <w:tc>
+          <w:tcPr>
+            <w:tcW w:type="dxa" w:w="4320"/>
+          </w:tcPr>
+          <w:p>
+            <w:r>
+              <w:t>{{CRIME_LOCATION}}</w:t>
+            </w:r>
+          </w:p>
+        </w:tc>
+      </w:tr>
+      <w:tr>
+        <w:tc>
+          <w:tcPr>
+            <w:tcW w:type="dxa" w:w="4320"/>
+          </w:tcPr>
+          <w:p>
+            <w:r>
+              <w:rPr>
+                <w:b/>
+              </w:rPr>
+              <w:t>BNS Sections</w:t>
+            </w:r>
+          </w:p>
+        </w:tc>
+        <w:tc>
+          <w:tcPr>
+            <w:tcW w:type="dxa" w:w="4320"/>
+          </w:tcPr>
+          <w:p>
+            <w:r>
+              <w:t>{{BNS_SECTIONS}}</w:t>
+            </w:r>
+          </w:p>
+        </w:tc>
+      </w:tr>
+      <w:tr>
+        <w:tc>
+          <w:tcPr>
+            <w:tcW w:type="dxa" w:w="4320"/>
+          </w:tcPr>
+          <w:p>
+            <w:r>
+              <w:rPr>
+                <w:b/>
+              </w:rPr>
+              <w:t>BNSS Sections</w:t>
+            </w:r>
+          </w:p>
+        </w:tc>
+        <w:tc>
+          <w:tcPr>
+            <w:tcW w:type="dxa" w:w="4320"/>
+          </w:tcPr>
+          <w:p>
+            <w:r>
+              <w:t>{{BNSS_SECTIONS}}</w:t>
+            </w:r>
+          </w:p>
+        </w:tc>
+      </w:tr>
+    </w:tbl>
+    <w:p/>
+    <w:p>
+      <w:r>
+        <w:rPr>
+          <w:b/>
+        </w:rPr>
+        <w:t>COMPLAINT NARRATIVE</w:t>
+      </w:r>
+    </w:p>
+    <w:p>
+      <w:r>
+        <w:t>{{CRIME_NARRATIVE}}</w:t>
+      </w:r>
+    </w:p>
+    <w:p/>
+    <w:p>
+      <w:r>
+        <w:rPr>
+          <w:b/>
+        </w:rPr>
+        <w:t>ACCUSED DETAILS</w:t>
+      </w:r>
+    </w:p>
+    <w:tbl>
+      <w:tblPr>
+        <w:tblStyle w:val="TableGrid"/>
+        <w:tblW w:type="auto" w:w="0"/>
+        <w:tblLook w:firstColumn="1" w:firstRow="1" w:lastColumn="0" w:lastRow="0" w:noHBand="0" w:noVBand="1" w:val="04A0"/>
+      </w:tblPr>
+      <w:tblGrid>
+        <w:gridCol w:w="4320"/>
+        <w:gridCol w:w="4320"/>
+      </w:tblGrid>
+      <w:tr>
+        <w:tc>
+          <w:tcPr>
+            <w:tcW w:type="dxa" w:w="4320"/>
+          </w:tcPr>
+          <w:p>
+            <w:r>
+              <w:rPr>
+                <w:b/>
+              </w:rPr>
+              <w:t>Accused Name</w:t>
+            </w:r>
+          </w:p>
+        </w:tc>
+        <w:tc>
+          <w:tcPr>
+            <w:tcW w:type="dxa" w:w="4320"/>
+          </w:tcPr>
+          <w:p>
+            <w:r>
+              <w:t>{{ACCUSED_NAME}}</w:t>
+            </w:r>
+          </w:p>
+        </w:tc>
+      </w:tr>
+      <w:tr>
+        <w:tc>
+          <w:tcPr>
+            <w:tcW w:type="dxa" w:w="4320"/>
+          </w:tcPr>
+          <w:p>
+            <w:r>
+              <w:rPr>
+                <w:b/>
+              </w:rPr>
+              <w:t>Address</w:t>
+            </w:r>
+          </w:p>
+        </w:tc>
+        <w:tc>
+          <w:tcPr>
+            <w:tcW w:type="dxa" w:w="4320"/>
+          </w:tcPr>
+          <w:p>
+            <w:r>
+              <w:t>{{ACCUSED_ADDRESS}}</w:t>
+            </w:r>
+          </w:p>
+        </w:tc>
+      </w:tr>
+      <w:tr>
+        <w:tc>
+          <w:tcPr>
+            <w:tcW w:type="dxa" w:w="4320"/>
+          </w:tcPr>
+          <w:p>
+            <w:r>
+              <w:rPr>
+                <w:b/>
+              </w:rPr>
+              <w:t>Age</w:t>
+            </w:r>
+          </w:p>
+        </w:tc>
+        <w:tc>
+          <w:tcPr>
+            <w:tcW w:type="dxa" w:w="4320"/>
+          </w:tcPr>
+          <w:p>
+            <w:r>
+              <w:t>{{ACCUSED_AGE}}</w:t>
+            </w:r>
+          </w:p>
+        </w:tc>
+      </w:tr>
+    </w:tbl>
+    <w:p/>
+    <w:p>
+      <w:r>
+        <w:rPr>
+          <w:b/>
+        </w:rPr>
+        <w:t>EVIDENCE &amp; WITNESSES</w:t>
+      </w:r>
+    </w:p>
+    <w:tbl>
+      <w:tblPr>
+        <w:tblStyle w:val="TableGrid"/>
+        <w:tblW w:type="auto" w:w="0"/>
+        <w:tblLook w:firstColumn="1" w:firstRow="1" w:lastColumn="0" w:lastRow="0" w:noHBand="0" w:noVBand="1" w:val="04A0"/>
+      </w:tblPr>
+      <w:tblGrid>
+        <w:gridCol w:w="4320"/>
+        <w:gridCol w:w="4320"/>
+      </w:tblGrid>
+      <w:tr>
+        <w:tc>
+          <w:tcPr>
+            <w:tcW w:type="dxa" w:w="4320"/>
+          </w:tcPr>
+          <w:p>
+            <w:r>
+              <w:rPr>
+                <w:b/>
+              </w:rPr>
+              <w:t>Evidence Items</w:t>
+            </w:r>
+          </w:p>
+        </w:tc>
+        <w:tc>
+          <w:tcPr>
+            <w:tcW w:type="dxa" w:w="4320"/>
+          </w:tcPr>
+          <w:p>
+            <w:r>
+              <w:t>{{EVIDENCE_LIST}}</w:t>
+            </w:r>
+          </w:p>
+        </w:tc>
+      </w:tr>
+      <w:tr>
+        <w:tc>
+          <w:tcPr>
+            <w:tcW w:type="dxa" w:w="4320"/>
+          </w:tcPr>
+          <w:p>
+            <w:r>
+              <w:rPr>
+                <w:b/>
+              </w:rPr>
+              <w:t>Witnesses</w:t>
+            </w:r>
+          </w:p>
+        </w:tc>
+        <w:tc>
+          <w:tcPr>
+            <w:tcW w:type="dxa" w:w="4320"/>
+          </w:tcPr>
+          <w:p>
+            <w:r>
+              <w:t>{{WITNESS_LIST}}</w:t>
+            </w:r>
+          </w:p>
+        </w:tc>
+      </w:tr>
+      <w:tr>
+        <w:tc>
+          <w:tcPr>
+            <w:tcW w:type="dxa" w:w="4320"/>
+          </w:tcPr>
+          <w:p>
+            <w:r>
+              <w:rPr>
+                <w:b/>
+              </w:rPr>
+              <w:t>IPC Cross-Reference</w:t>
+            </w:r>
+          </w:p>
+        </w:tc>
+        <w:tc>
+          <w:tcPr>
+            <w:tcW w:type="dxa" w:w="4320"/>
+          </w:tcPr>
+          <w:p>
+            <w:r>
+              <w:t>{{IPC_CROSSREF}}</w:t>
+            </w:r>
+          </w:p>
+        </w:tc>
+      </w:tr>
+    </w:tbl>
+    <w:p/>
+    <w:p/>
+    <w:p>
+      <w:r>
+        <w:t>Signature of Investigating Officer: _______________________</w:t>
+      </w:r>
+      <w:r>
+        <w:br/>
+        <w:br/>
+        <w:t>Name: {{IO_NAME}}     Badge: {{IO_BADGE}}     Date: {{DATE}}</w:t>
       </w:r>
     </w:p>
     <w:sectPr>

</xml_diff>